<commit_message>
Uploaded data for 2026-03-19:15-29-33
</commit_message>
<xml_diff>
--- a/Ggeo/Earthquakes/RelativeDatingTable123.docx
+++ b/Ggeo/Earthquakes/RelativeDatingTable123.docx
@@ -296,21 +296,12 @@
               <w:widowControl w:val="0"/>
               <w:jc w:val="center"/>
               <w:rPr>
-                <w:rFonts w:hint="default" w:ascii="Calibri" w:hAnsi="Calibri" w:eastAsia="Calibri" w:cs="Calibri"/>
-                <w:sz w:val="32"/>
-                <w:szCs w:val="32"/>
-                <w:lang w:val="en-US"/>
-              </w:rPr>
-            </w:pPr>
-            <w:r>
-              <w:rPr>
-                <w:rFonts w:hint="default" w:ascii="Calibri" w:hAnsi="Calibri" w:eastAsia="Calibri" w:cs="Calibri"/>
-                <w:sz w:val="32"/>
-                <w:szCs w:val="32"/>
-                <w:lang w:val="en-US"/>
-              </w:rPr>
-              <w:t>D</w:t>
-            </w:r>
+                <w:rFonts w:ascii="Calibri" w:hAnsi="Calibri" w:eastAsia="Calibri" w:cs="Calibri"/>
+                <w:sz w:val="32"/>
+                <w:szCs w:val="32"/>
+                <w:lang w:val="en-US"/>
+              </w:rPr>
+            </w:pPr>
           </w:p>
         </w:tc>
         <w:tc>
@@ -327,21 +318,12 @@
             <w:pPr>
               <w:widowControl w:val="0"/>
               <w:rPr>
-                <w:rFonts w:hint="default" w:ascii="Calibri" w:hAnsi="Calibri" w:eastAsia="Calibri" w:cs="Calibri"/>
-                <w:sz w:val="32"/>
-                <w:szCs w:val="32"/>
-                <w:lang w:val="en-US"/>
-              </w:rPr>
-            </w:pPr>
-            <w:r>
-              <w:rPr>
-                <w:rFonts w:hint="default" w:ascii="Calibri" w:hAnsi="Calibri" w:eastAsia="Calibri" w:cs="Calibri"/>
-                <w:sz w:val="32"/>
-                <w:szCs w:val="32"/>
-                <w:lang w:val="en-US"/>
-              </w:rPr>
-              <w:t>Deep ocean</w:t>
-            </w:r>
+                <w:rFonts w:ascii="Calibri" w:hAnsi="Calibri" w:eastAsia="Calibri" w:cs="Calibri"/>
+                <w:sz w:val="32"/>
+                <w:szCs w:val="32"/>
+                <w:lang w:val="en-US"/>
+              </w:rPr>
+            </w:pPr>
           </w:p>
         </w:tc>
         <w:tc>
@@ -358,21 +340,12 @@
             <w:pPr>
               <w:widowControl w:val="0"/>
               <w:rPr>
-                <w:rFonts w:hint="default" w:ascii="Calibri" w:hAnsi="Calibri" w:eastAsia="Calibri" w:cs="Calibri"/>
-                <w:sz w:val="32"/>
-                <w:szCs w:val="32"/>
-                <w:lang w:val="en-US"/>
-              </w:rPr>
-            </w:pPr>
-            <w:r>
-              <w:rPr>
-                <w:rFonts w:hint="default" w:ascii="Calibri" w:hAnsi="Calibri" w:eastAsia="Calibri" w:cs="Calibri"/>
-                <w:sz w:val="32"/>
-                <w:szCs w:val="32"/>
-                <w:lang w:val="en-US"/>
-              </w:rPr>
-              <w:t>Sedimentation</w:t>
-            </w:r>
+                <w:rFonts w:ascii="Calibri" w:hAnsi="Calibri" w:eastAsia="Calibri" w:cs="Calibri"/>
+                <w:sz w:val="32"/>
+                <w:szCs w:val="32"/>
+                <w:lang w:val="en-US"/>
+              </w:rPr>
+            </w:pPr>
           </w:p>
         </w:tc>
         <w:tc>
@@ -457,21 +430,12 @@
               <w:widowControl w:val="0"/>
               <w:jc w:val="center"/>
               <w:rPr>
-                <w:rFonts w:hint="default" w:ascii="Calibri" w:hAnsi="Calibri" w:eastAsia="Calibri" w:cs="Calibri"/>
-                <w:sz w:val="32"/>
-                <w:szCs w:val="32"/>
-                <w:lang w:val="en-US"/>
-              </w:rPr>
-            </w:pPr>
-            <w:r>
-              <w:rPr>
-                <w:rFonts w:hint="default" w:ascii="Calibri" w:hAnsi="Calibri" w:eastAsia="Calibri" w:cs="Calibri"/>
-                <w:sz w:val="32"/>
-                <w:szCs w:val="32"/>
-                <w:lang w:val="en-US"/>
-              </w:rPr>
-              <w:t>G</w:t>
-            </w:r>
+                <w:rFonts w:ascii="Calibri" w:hAnsi="Calibri" w:eastAsia="Calibri" w:cs="Calibri"/>
+                <w:sz w:val="32"/>
+                <w:szCs w:val="32"/>
+                <w:lang w:val="en-US"/>
+              </w:rPr>
+            </w:pPr>
           </w:p>
         </w:tc>
         <w:tc>
@@ -488,21 +452,12 @@
             <w:pPr>
               <w:widowControl w:val="0"/>
               <w:rPr>
-                <w:rFonts w:hint="default" w:ascii="Calibri" w:hAnsi="Calibri" w:eastAsia="Calibri" w:cs="Calibri"/>
-                <w:sz w:val="32"/>
-                <w:szCs w:val="32"/>
-                <w:lang w:val="en-US"/>
-              </w:rPr>
-            </w:pPr>
-            <w:r>
-              <w:rPr>
-                <w:rFonts w:hint="default" w:ascii="Calibri" w:hAnsi="Calibri" w:eastAsia="Calibri" w:cs="Calibri"/>
-                <w:sz w:val="32"/>
-                <w:szCs w:val="32"/>
-                <w:lang w:val="en-US"/>
-              </w:rPr>
-              <w:t>Vulcanic activity</w:t>
-            </w:r>
+                <w:rFonts w:ascii="Calibri" w:hAnsi="Calibri" w:eastAsia="Calibri" w:cs="Calibri"/>
+                <w:sz w:val="32"/>
+                <w:szCs w:val="32"/>
+                <w:lang w:val="en-US"/>
+              </w:rPr>
+            </w:pPr>
           </w:p>
         </w:tc>
         <w:tc>
@@ -519,23 +474,12 @@
             <w:pPr>
               <w:widowControl w:val="0"/>
               <w:rPr>
-                <w:rFonts w:hint="default" w:ascii="Calibri" w:hAnsi="Calibri" w:eastAsia="Calibri" w:cs="Calibri"/>
-                <w:sz w:val="32"/>
-                <w:szCs w:val="32"/>
-                <w:lang w:val="en-US"/>
-              </w:rPr>
-            </w:pPr>
-            <w:r>
-              <w:rPr>
-                <w:rFonts w:hint="default" w:ascii="Calibri" w:hAnsi="Calibri" w:eastAsia="Calibri" w:cs="Calibri"/>
-                <w:sz w:val="32"/>
-                <w:szCs w:val="32"/>
-                <w:lang w:val="en-US"/>
-              </w:rPr>
-              <w:t>s</w:t>
-            </w:r>
-            <w:bookmarkStart w:id="0" w:name="_GoBack"/>
-            <w:bookmarkEnd w:id="0"/>
+                <w:rFonts w:ascii="Calibri" w:hAnsi="Calibri" w:eastAsia="Calibri" w:cs="Calibri"/>
+                <w:sz w:val="32"/>
+                <w:szCs w:val="32"/>
+                <w:lang w:val="en-US"/>
+              </w:rPr>
+            </w:pPr>
           </w:p>
         </w:tc>
         <w:tc>
@@ -3772,12 +3716,21 @@
               <w:widowControl w:val="0"/>
               <w:jc w:val="center"/>
               <w:rPr>
-                <w:rFonts w:ascii="Calibri" w:hAnsi="Calibri" w:eastAsia="Calibri" w:cs="Calibri"/>
-                <w:sz w:val="32"/>
-                <w:szCs w:val="32"/>
-                <w:lang w:val="en-US"/>
-              </w:rPr>
-            </w:pPr>
+                <w:rFonts w:hint="default" w:ascii="Calibri" w:hAnsi="Calibri" w:eastAsia="Calibri" w:cs="Calibri"/>
+                <w:sz w:val="32"/>
+                <w:szCs w:val="32"/>
+                <w:lang w:val="en-US"/>
+              </w:rPr>
+            </w:pPr>
+            <w:r>
+              <w:rPr>
+                <w:rFonts w:hint="default" w:ascii="Calibri" w:hAnsi="Calibri" w:eastAsia="Calibri" w:cs="Calibri"/>
+                <w:sz w:val="32"/>
+                <w:szCs w:val="32"/>
+                <w:lang w:val="en-US"/>
+              </w:rPr>
+              <w:t>B</w:t>
+            </w:r>
           </w:p>
         </w:tc>
         <w:tc>
@@ -3794,12 +3747,21 @@
             <w:pPr>
               <w:widowControl w:val="0"/>
               <w:rPr>
-                <w:rFonts w:ascii="Calibri" w:hAnsi="Calibri" w:eastAsia="Calibri" w:cs="Calibri"/>
-                <w:sz w:val="32"/>
-                <w:szCs w:val="32"/>
-                <w:lang w:val="en-US"/>
-              </w:rPr>
-            </w:pPr>
+                <w:rFonts w:hint="default" w:ascii="Calibri" w:hAnsi="Calibri" w:eastAsia="Calibri" w:cs="Calibri"/>
+                <w:sz w:val="32"/>
+                <w:szCs w:val="32"/>
+                <w:lang w:val="en-US"/>
+              </w:rPr>
+            </w:pPr>
+            <w:r>
+              <w:rPr>
+                <w:rFonts w:hint="default" w:ascii="Calibri" w:hAnsi="Calibri" w:eastAsia="Calibri" w:cs="Calibri"/>
+                <w:sz w:val="32"/>
+                <w:szCs w:val="32"/>
+                <w:lang w:val="en-US"/>
+              </w:rPr>
+              <w:t>Very deep ocean because only clay formed in that place with no limestone.</w:t>
+            </w:r>
           </w:p>
         </w:tc>
         <w:tc>
@@ -3816,12 +3778,21 @@
             <w:pPr>
               <w:widowControl w:val="0"/>
               <w:rPr>
-                <w:rFonts w:ascii="Calibri" w:hAnsi="Calibri" w:eastAsia="Calibri" w:cs="Calibri"/>
-                <w:sz w:val="32"/>
-                <w:szCs w:val="32"/>
-                <w:lang w:val="en-US"/>
-              </w:rPr>
-            </w:pPr>
+                <w:rFonts w:hint="default" w:ascii="Calibri" w:hAnsi="Calibri" w:eastAsia="Calibri" w:cs="Calibri"/>
+                <w:sz w:val="32"/>
+                <w:szCs w:val="32"/>
+                <w:lang w:val="en-US"/>
+              </w:rPr>
+            </w:pPr>
+            <w:r>
+              <w:rPr>
+                <w:rFonts w:hint="default" w:ascii="Calibri" w:hAnsi="Calibri" w:eastAsia="Calibri" w:cs="Calibri"/>
+                <w:sz w:val="32"/>
+                <w:szCs w:val="32"/>
+                <w:lang w:val="en-US"/>
+              </w:rPr>
+              <w:t>Sedimentation</w:t>
+            </w:r>
           </w:p>
         </w:tc>
         <w:tc>
@@ -3906,12 +3877,21 @@
               <w:widowControl w:val="0"/>
               <w:jc w:val="center"/>
               <w:rPr>
-                <w:rFonts w:ascii="Calibri" w:hAnsi="Calibri" w:eastAsia="Calibri" w:cs="Calibri"/>
-                <w:sz w:val="32"/>
-                <w:szCs w:val="32"/>
-                <w:lang w:val="en-US"/>
-              </w:rPr>
-            </w:pPr>
+                <w:rFonts w:hint="default" w:ascii="Calibri" w:hAnsi="Calibri" w:eastAsia="Calibri" w:cs="Calibri"/>
+                <w:sz w:val="32"/>
+                <w:szCs w:val="32"/>
+                <w:lang w:val="en-US"/>
+              </w:rPr>
+            </w:pPr>
+            <w:r>
+              <w:rPr>
+                <w:rFonts w:hint="default" w:ascii="Calibri" w:hAnsi="Calibri" w:eastAsia="Calibri" w:cs="Calibri"/>
+                <w:sz w:val="32"/>
+                <w:szCs w:val="32"/>
+                <w:lang w:val="en-US"/>
+              </w:rPr>
+              <w:t>B,C</w:t>
+            </w:r>
           </w:p>
         </w:tc>
         <w:tc>
@@ -3928,12 +3908,21 @@
             <w:pPr>
               <w:widowControl w:val="0"/>
               <w:rPr>
-                <w:rFonts w:ascii="Calibri" w:hAnsi="Calibri" w:eastAsia="Calibri" w:cs="Calibri"/>
-                <w:sz w:val="32"/>
-                <w:szCs w:val="32"/>
-                <w:lang w:val="en-US"/>
-              </w:rPr>
-            </w:pPr>
+                <w:rFonts w:hint="default" w:ascii="Calibri" w:hAnsi="Calibri" w:eastAsia="Calibri" w:cs="Calibri"/>
+                <w:sz w:val="32"/>
+                <w:szCs w:val="32"/>
+                <w:lang w:val="en-US"/>
+              </w:rPr>
+            </w:pPr>
+            <w:r>
+              <w:rPr>
+                <w:rFonts w:hint="default" w:ascii="Calibri" w:hAnsi="Calibri" w:eastAsia="Calibri" w:cs="Calibri"/>
+                <w:sz w:val="32"/>
+                <w:szCs w:val="32"/>
+                <w:lang w:val="en-US"/>
+              </w:rPr>
+              <w:t>River? Glacier?</w:t>
+            </w:r>
           </w:p>
         </w:tc>
         <w:tc>
@@ -3950,12 +3939,23 @@
             <w:pPr>
               <w:widowControl w:val="0"/>
               <w:rPr>
-                <w:rFonts w:ascii="Calibri" w:hAnsi="Calibri" w:eastAsia="Calibri" w:cs="Calibri"/>
-                <w:sz w:val="32"/>
-                <w:szCs w:val="32"/>
-                <w:lang w:val="en-US"/>
-              </w:rPr>
-            </w:pPr>
+                <w:rFonts w:hint="default" w:ascii="Calibri" w:hAnsi="Calibri" w:eastAsia="Calibri" w:cs="Calibri"/>
+                <w:sz w:val="32"/>
+                <w:szCs w:val="32"/>
+                <w:lang w:val="en-US"/>
+              </w:rPr>
+            </w:pPr>
+            <w:r>
+              <w:rPr>
+                <w:rFonts w:hint="default" w:ascii="Calibri" w:hAnsi="Calibri" w:eastAsia="Calibri" w:cs="Calibri"/>
+                <w:sz w:val="32"/>
+                <w:szCs w:val="32"/>
+                <w:lang w:val="en-US"/>
+              </w:rPr>
+              <w:t>Erosionch</w:t>
+            </w:r>
+            <w:bookmarkStart w:id="0" w:name="_GoBack"/>
+            <w:bookmarkEnd w:id="0"/>
           </w:p>
         </w:tc>
         <w:tc>
@@ -4040,12 +4040,21 @@
               <w:widowControl w:val="0"/>
               <w:jc w:val="center"/>
               <w:rPr>
-                <w:rFonts w:ascii="Calibri" w:hAnsi="Calibri" w:eastAsia="Calibri" w:cs="Calibri"/>
-                <w:sz w:val="32"/>
-                <w:szCs w:val="32"/>
-                <w:lang w:val="en-US"/>
-              </w:rPr>
-            </w:pPr>
+                <w:rFonts w:hint="default" w:ascii="Calibri" w:hAnsi="Calibri" w:eastAsia="Calibri" w:cs="Calibri"/>
+                <w:sz w:val="32"/>
+                <w:szCs w:val="32"/>
+                <w:lang w:val="en-US"/>
+              </w:rPr>
+            </w:pPr>
+            <w:r>
+              <w:rPr>
+                <w:rFonts w:hint="default" w:ascii="Calibri" w:hAnsi="Calibri" w:eastAsia="Calibri" w:cs="Calibri"/>
+                <w:sz w:val="32"/>
+                <w:szCs w:val="32"/>
+                <w:lang w:val="en-US"/>
+              </w:rPr>
+              <w:t>C</w:t>
+            </w:r>
           </w:p>
         </w:tc>
         <w:tc>
@@ -4062,12 +4071,21 @@
             <w:pPr>
               <w:widowControl w:val="0"/>
               <w:rPr>
-                <w:rFonts w:ascii="Calibri" w:hAnsi="Calibri" w:eastAsia="Calibri" w:cs="Calibri"/>
-                <w:sz w:val="32"/>
-                <w:szCs w:val="32"/>
-                <w:lang w:val="en-US"/>
-              </w:rPr>
-            </w:pPr>
+                <w:rFonts w:hint="default" w:ascii="Calibri" w:hAnsi="Calibri" w:eastAsia="Calibri" w:cs="Calibri"/>
+                <w:sz w:val="32"/>
+                <w:szCs w:val="32"/>
+                <w:lang w:val="en-US"/>
+              </w:rPr>
+            </w:pPr>
+            <w:r>
+              <w:rPr>
+                <w:rFonts w:hint="default" w:ascii="Calibri" w:hAnsi="Calibri" w:eastAsia="Calibri" w:cs="Calibri"/>
+                <w:sz w:val="32"/>
+                <w:szCs w:val="32"/>
+                <w:lang w:val="en-US"/>
+              </w:rPr>
+              <w:t>At the bottom of a little less deep ocean clay and limestone sedimented.</w:t>
+            </w:r>
           </w:p>
         </w:tc>
         <w:tc>
@@ -4084,12 +4102,21 @@
             <w:pPr>
               <w:widowControl w:val="0"/>
               <w:rPr>
-                <w:rFonts w:ascii="Calibri" w:hAnsi="Calibri" w:eastAsia="Calibri" w:cs="Calibri"/>
-                <w:sz w:val="32"/>
-                <w:szCs w:val="32"/>
-                <w:lang w:val="en-US"/>
-              </w:rPr>
-            </w:pPr>
+                <w:rFonts w:hint="default" w:ascii="Calibri" w:hAnsi="Calibri" w:eastAsia="Calibri" w:cs="Calibri"/>
+                <w:sz w:val="32"/>
+                <w:szCs w:val="32"/>
+                <w:lang w:val="en-US"/>
+              </w:rPr>
+            </w:pPr>
+            <w:r>
+              <w:rPr>
+                <w:rFonts w:hint="default" w:ascii="Calibri" w:hAnsi="Calibri" w:eastAsia="Calibri" w:cs="Calibri"/>
+                <w:sz w:val="32"/>
+                <w:szCs w:val="32"/>
+                <w:lang w:val="en-US"/>
+              </w:rPr>
+              <w:t>Sedimentation</w:t>
+            </w:r>
           </w:p>
         </w:tc>
         <w:tc>
@@ -4174,12 +4201,21 @@
               <w:widowControl w:val="0"/>
               <w:jc w:val="center"/>
               <w:rPr>
-                <w:rFonts w:ascii="Calibri" w:hAnsi="Calibri" w:eastAsia="Calibri" w:cs="Calibri"/>
-                <w:sz w:val="32"/>
-                <w:szCs w:val="32"/>
-                <w:lang w:val="en-US"/>
-              </w:rPr>
-            </w:pPr>
+                <w:rFonts w:hint="default" w:ascii="Calibri" w:hAnsi="Calibri" w:eastAsia="Calibri" w:cs="Calibri"/>
+                <w:sz w:val="32"/>
+                <w:szCs w:val="32"/>
+                <w:lang w:val="en-US"/>
+              </w:rPr>
+            </w:pPr>
+            <w:r>
+              <w:rPr>
+                <w:rFonts w:hint="default" w:ascii="Calibri" w:hAnsi="Calibri" w:eastAsia="Calibri" w:cs="Calibri"/>
+                <w:sz w:val="32"/>
+                <w:szCs w:val="32"/>
+                <w:lang w:val="en-US"/>
+              </w:rPr>
+              <w:t>A</w:t>
+            </w:r>
           </w:p>
         </w:tc>
         <w:tc>
@@ -4202,6 +4238,15 @@
                 <w:lang w:val="en-US"/>
               </w:rPr>
             </w:pPr>
+            <w:r>
+              <w:rPr>
+                <w:rFonts w:hint="default" w:ascii="Calibri" w:hAnsi="Calibri" w:eastAsia="Calibri" w:cs="Calibri"/>
+                <w:sz w:val="32"/>
+                <w:szCs w:val="32"/>
+                <w:lang w:val="en-US"/>
+              </w:rPr>
+              <w:t>A granite chamber has intruded the lavers B &amp; C and has coold of over a long time.</w:t>
+            </w:r>
           </w:p>
         </w:tc>
         <w:tc>
@@ -4224,6 +4269,15 @@
                 <w:lang w:val="en-US"/>
               </w:rPr>
             </w:pPr>
+            <w:r>
+              <w:rPr>
+                <w:rFonts w:hint="default" w:ascii="Calibri" w:hAnsi="Calibri" w:eastAsia="Calibri" w:cs="Calibri"/>
+                <w:sz w:val="32"/>
+                <w:szCs w:val="32"/>
+                <w:lang w:val="en-US"/>
+              </w:rPr>
+              <w:t>Cristalization</w:t>
+            </w:r>
           </w:p>
         </w:tc>
         <w:tc>

</xml_diff>